<commit_message>
Report: clickable table of contents in the Word version (scripts/add_report_toc.py)
</commit_message>
<xml_diff>
--- a/report/replication_report_zh.docx
+++ b/report/replication_report_zh.docx
@@ -151,6 +151,1205 @@
         </w:rPr>
       </w:pPr>
     </w:p>
+    <w:p w:rsidR="00TOC000">
+      <w:pPr>
+        <w:tabs>
+          <w:tab w:val="right" w:leader="dot" w:pos="9072"/>
+        </w:tabs>
+        <w:spacing w:after="160" w:line="300" w:lineRule="auto"/>
+        <w:ind w:left="0"/>
+      </w:pPr>
+      <w:r>
+        <w:rPr>
+          <w:rFonts w:ascii="Times New Roman" w:hAnsi="Times New Roman" w:eastAsia="宋体"/>
+          <w:b/>
+          <w:color w:val="1F3A5F"/>
+          <w:sz w:val="32"/>
+        </w:rPr>
+        <w:t xml:space="preserve">目　录</w:t>
+      </w:r>
+    </w:p>
+    <w:p w:rsidR="00TOC000">
+      <w:pPr>
+        <w:tabs>
+          <w:tab w:val="right" w:leader="dot" w:pos="9072"/>
+        </w:tabs>
+        <w:spacing w:after="60" w:line="300" w:lineRule="auto"/>
+        <w:ind w:left="0"/>
+      </w:pPr>
+      <w:r>
+        <w:rPr>
+          <w:rFonts w:ascii="Times New Roman" w:hAnsi="Times New Roman" w:eastAsia="宋体"/>
+          <w:sz w:val="21"/>
+        </w:rPr>
+        <w:fldChar w:fldCharType="begin"/>
+      </w:r>
+      <w:r>
+        <w:rPr>
+          <w:rFonts w:ascii="Times New Roman" w:hAnsi="Times New Roman" w:eastAsia="宋体"/>
+          <w:sz w:val="21"/>
+        </w:rPr>
+        <w:instrText xml:space="preserve"> TOC \o "2-3" \h \z \u </w:instrText>
+      </w:r>
+      <w:r>
+        <w:rPr>
+          <w:rFonts w:ascii="Times New Roman" w:hAnsi="Times New Roman" w:eastAsia="宋体"/>
+          <w:sz w:val="21"/>
+        </w:rPr>
+        <w:fldChar w:fldCharType="separate"/>
+      </w:r>
+      <w:hyperlink w:anchor="_TocReport001" w:history="1">
+        <w:r>
+          <w:rPr>
+            <w:rFonts w:ascii="Times New Roman" w:hAnsi="Times New Roman" w:eastAsia="宋体"/>
+            <w:b/>
+            <w:sz w:val="22"/>
+          </w:rPr>
+          <w:t xml:space="preserve">0. 结论一页</w:t>
+        </w:r>
+        <w:r>
+          <w:rPr>
+            <w:rFonts w:ascii="Times New Roman" w:hAnsi="Times New Roman" w:eastAsia="宋体"/>
+            <w:sz w:val="21"/>
+          </w:rPr>
+          <w:tab/>
+        </w:r>
+        <w:r>
+          <w:rPr>
+            <w:rFonts w:ascii="Times New Roman" w:hAnsi="Times New Roman" w:eastAsia="宋体"/>
+            <w:sz w:val="21"/>
+          </w:rPr>
+          <w:fldChar w:fldCharType="begin"/>
+        </w:r>
+        <w:r>
+          <w:rPr>
+            <w:rFonts w:ascii="Times New Roman" w:hAnsi="Times New Roman" w:eastAsia="宋体"/>
+            <w:sz w:val="21"/>
+          </w:rPr>
+          <w:instrText xml:space="preserve"> PAGEREF _TocReport001 \h </w:instrText>
+        </w:r>
+        <w:r>
+          <w:rPr>
+            <w:rFonts w:ascii="Times New Roman" w:hAnsi="Times New Roman" w:eastAsia="宋体"/>
+            <w:sz w:val="21"/>
+          </w:rPr>
+          <w:fldChar w:fldCharType="separate"/>
+        </w:r>
+        <w:r>
+          <w:rPr>
+            <w:rFonts w:ascii="Times New Roman" w:hAnsi="Times New Roman" w:eastAsia="宋体"/>
+            <w:sz w:val="21"/>
+          </w:rPr>
+          <w:t xml:space="preserve"/>
+        </w:r>
+        <w:r>
+          <w:rPr>
+            <w:rFonts w:ascii="Times New Roman" w:hAnsi="Times New Roman" w:eastAsia="宋体"/>
+            <w:sz w:val="21"/>
+          </w:rPr>
+          <w:fldChar w:fldCharType="end"/>
+        </w:r>
+      </w:hyperlink>
+    </w:p>
+    <w:p w:rsidR="00TOC000">
+      <w:pPr>
+        <w:tabs>
+          <w:tab w:val="right" w:leader="dot" w:pos="9072"/>
+        </w:tabs>
+        <w:spacing w:after="60" w:line="300" w:lineRule="auto"/>
+        <w:ind w:left="0"/>
+      </w:pPr>
+      <w:hyperlink w:anchor="_TocReport002" w:history="1">
+        <w:r>
+          <w:rPr>
+            <w:rFonts w:ascii="Times New Roman" w:hAnsi="Times New Roman" w:eastAsia="宋体"/>
+            <w:b/>
+            <w:sz w:val="22"/>
+          </w:rPr>
+          <w:t xml:space="preserve">1. 做法要点</w:t>
+        </w:r>
+        <w:r>
+          <w:rPr>
+            <w:rFonts w:ascii="Times New Roman" w:hAnsi="Times New Roman" w:eastAsia="宋体"/>
+            <w:sz w:val="21"/>
+          </w:rPr>
+          <w:tab/>
+        </w:r>
+        <w:r>
+          <w:rPr>
+            <w:rFonts w:ascii="Times New Roman" w:hAnsi="Times New Roman" w:eastAsia="宋体"/>
+            <w:sz w:val="21"/>
+          </w:rPr>
+          <w:fldChar w:fldCharType="begin"/>
+        </w:r>
+        <w:r>
+          <w:rPr>
+            <w:rFonts w:ascii="Times New Roman" w:hAnsi="Times New Roman" w:eastAsia="宋体"/>
+            <w:sz w:val="21"/>
+          </w:rPr>
+          <w:instrText xml:space="preserve"> PAGEREF _TocReport002 \h </w:instrText>
+        </w:r>
+        <w:r>
+          <w:rPr>
+            <w:rFonts w:ascii="Times New Roman" w:hAnsi="Times New Roman" w:eastAsia="宋体"/>
+            <w:sz w:val="21"/>
+          </w:rPr>
+          <w:fldChar w:fldCharType="separate"/>
+        </w:r>
+        <w:r>
+          <w:rPr>
+            <w:rFonts w:ascii="Times New Roman" w:hAnsi="Times New Roman" w:eastAsia="宋体"/>
+            <w:sz w:val="21"/>
+          </w:rPr>
+          <w:t xml:space="preserve"/>
+        </w:r>
+        <w:r>
+          <w:rPr>
+            <w:rFonts w:ascii="Times New Roman" w:hAnsi="Times New Roman" w:eastAsia="宋体"/>
+            <w:sz w:val="21"/>
+          </w:rPr>
+          <w:fldChar w:fldCharType="end"/>
+        </w:r>
+      </w:hyperlink>
+    </w:p>
+    <w:p w:rsidR="00TOC000">
+      <w:pPr>
+        <w:tabs>
+          <w:tab w:val="right" w:leader="dot" w:pos="9072"/>
+        </w:tabs>
+        <w:spacing w:after="60" w:line="300" w:lineRule="auto"/>
+        <w:ind w:left="0"/>
+      </w:pPr>
+      <w:hyperlink w:anchor="_TocReport003" w:history="1">
+        <w:r>
+          <w:rPr>
+            <w:rFonts w:ascii="Times New Roman" w:hAnsi="Times New Roman" w:eastAsia="宋体"/>
+            <w:b/>
+            <w:sz w:val="22"/>
+          </w:rPr>
+          <w:t xml:space="preserve">2. LSY（2019）：Size and value in China</w:t>
+        </w:r>
+        <w:r>
+          <w:rPr>
+            <w:rFonts w:ascii="Times New Roman" w:hAnsi="Times New Roman" w:eastAsia="宋体"/>
+            <w:sz w:val="21"/>
+          </w:rPr>
+          <w:tab/>
+        </w:r>
+        <w:r>
+          <w:rPr>
+            <w:rFonts w:ascii="Times New Roman" w:hAnsi="Times New Roman" w:eastAsia="宋体"/>
+            <w:sz w:val="21"/>
+          </w:rPr>
+          <w:fldChar w:fldCharType="begin"/>
+        </w:r>
+        <w:r>
+          <w:rPr>
+            <w:rFonts w:ascii="Times New Roman" w:hAnsi="Times New Roman" w:eastAsia="宋体"/>
+            <w:sz w:val="21"/>
+          </w:rPr>
+          <w:instrText xml:space="preserve"> PAGEREF _TocReport003 \h </w:instrText>
+        </w:r>
+        <w:r>
+          <w:rPr>
+            <w:rFonts w:ascii="Times New Roman" w:hAnsi="Times New Roman" w:eastAsia="宋体"/>
+            <w:sz w:val="21"/>
+          </w:rPr>
+          <w:fldChar w:fldCharType="separate"/>
+        </w:r>
+        <w:r>
+          <w:rPr>
+            <w:rFonts w:ascii="Times New Roman" w:hAnsi="Times New Roman" w:eastAsia="宋体"/>
+            <w:sz w:val="21"/>
+          </w:rPr>
+          <w:t xml:space="preserve"/>
+        </w:r>
+        <w:r>
+          <w:rPr>
+            <w:rFonts w:ascii="Times New Roman" w:hAnsi="Times New Roman" w:eastAsia="宋体"/>
+            <w:sz w:val="21"/>
+          </w:rPr>
+          <w:fldChar w:fldCharType="end"/>
+        </w:r>
+      </w:hyperlink>
+    </w:p>
+    <w:p w:rsidR="00TOC000">
+      <w:pPr>
+        <w:tabs>
+          <w:tab w:val="right" w:leader="dot" w:pos="9072"/>
+        </w:tabs>
+        <w:spacing w:after="60" w:line="300" w:lineRule="auto"/>
+        <w:ind w:left="425"/>
+      </w:pPr>
+      <w:hyperlink w:anchor="_TocReport004" w:history="1">
+        <w:r>
+          <w:rPr>
+            <w:rFonts w:ascii="Times New Roman" w:hAnsi="Times New Roman" w:eastAsia="宋体"/>
+            <w:sz w:val="21"/>
+          </w:rPr>
+          <w:t xml:space="preserve">2.1 我们 vs 论文</w:t>
+        </w:r>
+        <w:r>
+          <w:rPr>
+            <w:rFonts w:ascii="Times New Roman" w:hAnsi="Times New Roman" w:eastAsia="宋体"/>
+            <w:sz w:val="21"/>
+          </w:rPr>
+          <w:tab/>
+        </w:r>
+        <w:r>
+          <w:rPr>
+            <w:rFonts w:ascii="Times New Roman" w:hAnsi="Times New Roman" w:eastAsia="宋体"/>
+            <w:sz w:val="21"/>
+          </w:rPr>
+          <w:fldChar w:fldCharType="begin"/>
+        </w:r>
+        <w:r>
+          <w:rPr>
+            <w:rFonts w:ascii="Times New Roman" w:hAnsi="Times New Roman" w:eastAsia="宋体"/>
+            <w:sz w:val="21"/>
+          </w:rPr>
+          <w:instrText xml:space="preserve"> PAGEREF _TocReport004 \h </w:instrText>
+        </w:r>
+        <w:r>
+          <w:rPr>
+            <w:rFonts w:ascii="Times New Roman" w:hAnsi="Times New Roman" w:eastAsia="宋体"/>
+            <w:sz w:val="21"/>
+          </w:rPr>
+          <w:fldChar w:fldCharType="separate"/>
+        </w:r>
+        <w:r>
+          <w:rPr>
+            <w:rFonts w:ascii="Times New Roman" w:hAnsi="Times New Roman" w:eastAsia="宋体"/>
+            <w:sz w:val="21"/>
+          </w:rPr>
+          <w:t xml:space="preserve"/>
+        </w:r>
+        <w:r>
+          <w:rPr>
+            <w:rFonts w:ascii="Times New Roman" w:hAnsi="Times New Roman" w:eastAsia="宋体"/>
+            <w:sz w:val="21"/>
+          </w:rPr>
+          <w:fldChar w:fldCharType="end"/>
+        </w:r>
+      </w:hyperlink>
+    </w:p>
+    <w:p w:rsidR="00TOC000">
+      <w:pPr>
+        <w:tabs>
+          <w:tab w:val="right" w:leader="dot" w:pos="9072"/>
+        </w:tabs>
+        <w:spacing w:after="60" w:line="300" w:lineRule="auto"/>
+        <w:ind w:left="425"/>
+      </w:pPr>
+      <w:hyperlink w:anchor="_TocReport005" w:history="1">
+        <w:r>
+          <w:rPr>
+            <w:rFonts w:ascii="Times New Roman" w:hAnsi="Times New Roman" w:eastAsia="宋体"/>
+            <w:sz w:val="21"/>
+          </w:rPr>
+          <w:t xml:space="preserve">2.2 主要偏差及原因</w:t>
+        </w:r>
+        <w:r>
+          <w:rPr>
+            <w:rFonts w:ascii="Times New Roman" w:hAnsi="Times New Roman" w:eastAsia="宋体"/>
+            <w:sz w:val="21"/>
+          </w:rPr>
+          <w:tab/>
+        </w:r>
+        <w:r>
+          <w:rPr>
+            <w:rFonts w:ascii="Times New Roman" w:hAnsi="Times New Roman" w:eastAsia="宋体"/>
+            <w:sz w:val="21"/>
+          </w:rPr>
+          <w:fldChar w:fldCharType="begin"/>
+        </w:r>
+        <w:r>
+          <w:rPr>
+            <w:rFonts w:ascii="Times New Roman" w:hAnsi="Times New Roman" w:eastAsia="宋体"/>
+            <w:sz w:val="21"/>
+          </w:rPr>
+          <w:instrText xml:space="preserve"> PAGEREF _TocReport005 \h </w:instrText>
+        </w:r>
+        <w:r>
+          <w:rPr>
+            <w:rFonts w:ascii="Times New Roman" w:hAnsi="Times New Roman" w:eastAsia="宋体"/>
+            <w:sz w:val="21"/>
+          </w:rPr>
+          <w:fldChar w:fldCharType="separate"/>
+        </w:r>
+        <w:r>
+          <w:rPr>
+            <w:rFonts w:ascii="Times New Roman" w:hAnsi="Times New Roman" w:eastAsia="宋体"/>
+            <w:sz w:val="21"/>
+          </w:rPr>
+          <w:t xml:space="preserve"/>
+        </w:r>
+        <w:r>
+          <w:rPr>
+            <w:rFonts w:ascii="Times New Roman" w:hAnsi="Times New Roman" w:eastAsia="宋体"/>
+            <w:sz w:val="21"/>
+          </w:rPr>
+          <w:fldChar w:fldCharType="end"/>
+        </w:r>
+      </w:hyperlink>
+    </w:p>
+    <w:p w:rsidR="00TOC000">
+      <w:pPr>
+        <w:tabs>
+          <w:tab w:val="right" w:leader="dot" w:pos="9072"/>
+        </w:tabs>
+        <w:spacing w:after="60" w:line="300" w:lineRule="auto"/>
+        <w:ind w:left="425"/>
+      </w:pPr>
+      <w:hyperlink w:anchor="_TocReport006" w:history="1">
+        <w:r>
+          <w:rPr>
+            <w:rFonts w:ascii="Times New Roman" w:hAnsi="Times New Roman" w:eastAsia="宋体"/>
+            <w:sz w:val="21"/>
+          </w:rPr>
+          <w:t xml:space="preserve">2.3 图</w:t>
+        </w:r>
+        <w:r>
+          <w:rPr>
+            <w:rFonts w:ascii="Times New Roman" w:hAnsi="Times New Roman" w:eastAsia="宋体"/>
+            <w:sz w:val="21"/>
+          </w:rPr>
+          <w:tab/>
+        </w:r>
+        <w:r>
+          <w:rPr>
+            <w:rFonts w:ascii="Times New Roman" w:hAnsi="Times New Roman" w:eastAsia="宋体"/>
+            <w:sz w:val="21"/>
+          </w:rPr>
+          <w:fldChar w:fldCharType="begin"/>
+        </w:r>
+        <w:r>
+          <w:rPr>
+            <w:rFonts w:ascii="Times New Roman" w:hAnsi="Times New Roman" w:eastAsia="宋体"/>
+            <w:sz w:val="21"/>
+          </w:rPr>
+          <w:instrText xml:space="preserve"> PAGEREF _TocReport006 \h </w:instrText>
+        </w:r>
+        <w:r>
+          <w:rPr>
+            <w:rFonts w:ascii="Times New Roman" w:hAnsi="Times New Roman" w:eastAsia="宋体"/>
+            <w:sz w:val="21"/>
+          </w:rPr>
+          <w:fldChar w:fldCharType="separate"/>
+        </w:r>
+        <w:r>
+          <w:rPr>
+            <w:rFonts w:ascii="Times New Roman" w:hAnsi="Times New Roman" w:eastAsia="宋体"/>
+            <w:sz w:val="21"/>
+          </w:rPr>
+          <w:t xml:space="preserve"/>
+        </w:r>
+        <w:r>
+          <w:rPr>
+            <w:rFonts w:ascii="Times New Roman" w:hAnsi="Times New Roman" w:eastAsia="宋体"/>
+            <w:sz w:val="21"/>
+          </w:rPr>
+          <w:fldChar w:fldCharType="end"/>
+        </w:r>
+      </w:hyperlink>
+    </w:p>
+    <w:p w:rsidR="00TOC000">
+      <w:pPr>
+        <w:tabs>
+          <w:tab w:val="right" w:leader="dot" w:pos="9072"/>
+        </w:tabs>
+        <w:spacing w:after="60" w:line="300" w:lineRule="auto"/>
+        <w:ind w:left="425"/>
+      </w:pPr>
+      <w:hyperlink w:anchor="_TocReport007" w:history="1">
+        <w:r>
+          <w:rPr>
+            <w:rFonts w:ascii="Times New Roman" w:hAnsi="Times New Roman" w:eastAsia="宋体"/>
+            <w:sz w:val="21"/>
+          </w:rPr>
+          <w:t xml:space="preserve">2.4 延长到 2026 年</w:t>
+        </w:r>
+        <w:r>
+          <w:rPr>
+            <w:rFonts w:ascii="Times New Roman" w:hAnsi="Times New Roman" w:eastAsia="宋体"/>
+            <w:sz w:val="21"/>
+          </w:rPr>
+          <w:tab/>
+        </w:r>
+        <w:r>
+          <w:rPr>
+            <w:rFonts w:ascii="Times New Roman" w:hAnsi="Times New Roman" w:eastAsia="宋体"/>
+            <w:sz w:val="21"/>
+          </w:rPr>
+          <w:fldChar w:fldCharType="begin"/>
+        </w:r>
+        <w:r>
+          <w:rPr>
+            <w:rFonts w:ascii="Times New Roman" w:hAnsi="Times New Roman" w:eastAsia="宋体"/>
+            <w:sz w:val="21"/>
+          </w:rPr>
+          <w:instrText xml:space="preserve"> PAGEREF _TocReport007 \h </w:instrText>
+        </w:r>
+        <w:r>
+          <w:rPr>
+            <w:rFonts w:ascii="Times New Roman" w:hAnsi="Times New Roman" w:eastAsia="宋体"/>
+            <w:sz w:val="21"/>
+          </w:rPr>
+          <w:fldChar w:fldCharType="separate"/>
+        </w:r>
+        <w:r>
+          <w:rPr>
+            <w:rFonts w:ascii="Times New Roman" w:hAnsi="Times New Roman" w:eastAsia="宋体"/>
+            <w:sz w:val="21"/>
+          </w:rPr>
+          <w:t xml:space="preserve"/>
+        </w:r>
+        <w:r>
+          <w:rPr>
+            <w:rFonts w:ascii="Times New Roman" w:hAnsi="Times New Roman" w:eastAsia="宋体"/>
+            <w:sz w:val="21"/>
+          </w:rPr>
+          <w:fldChar w:fldCharType="end"/>
+        </w:r>
+      </w:hyperlink>
+    </w:p>
+    <w:p w:rsidR="00TOC000">
+      <w:pPr>
+        <w:tabs>
+          <w:tab w:val="right" w:leader="dot" w:pos="9072"/>
+        </w:tabs>
+        <w:spacing w:after="60" w:line="300" w:lineRule="auto"/>
+        <w:ind w:left="0"/>
+      </w:pPr>
+      <w:hyperlink w:anchor="_TocReport008" w:history="1">
+        <w:r>
+          <w:rPr>
+            <w:rFonts w:ascii="Times New Roman" w:hAnsi="Times New Roman" w:eastAsia="宋体"/>
+            <w:b/>
+            <w:sz w:val="22"/>
+          </w:rPr>
+          <w:t xml:space="preserve">3. Allen（2024）：Dissecting the long-term performance of the Chinese stock market</w:t>
+        </w:r>
+        <w:r>
+          <w:rPr>
+            <w:rFonts w:ascii="Times New Roman" w:hAnsi="Times New Roman" w:eastAsia="宋体"/>
+            <w:sz w:val="21"/>
+          </w:rPr>
+          <w:tab/>
+        </w:r>
+        <w:r>
+          <w:rPr>
+            <w:rFonts w:ascii="Times New Roman" w:hAnsi="Times New Roman" w:eastAsia="宋体"/>
+            <w:sz w:val="21"/>
+          </w:rPr>
+          <w:fldChar w:fldCharType="begin"/>
+        </w:r>
+        <w:r>
+          <w:rPr>
+            <w:rFonts w:ascii="Times New Roman" w:hAnsi="Times New Roman" w:eastAsia="宋体"/>
+            <w:sz w:val="21"/>
+          </w:rPr>
+          <w:instrText xml:space="preserve"> PAGEREF _TocReport008 \h </w:instrText>
+        </w:r>
+        <w:r>
+          <w:rPr>
+            <w:rFonts w:ascii="Times New Roman" w:hAnsi="Times New Roman" w:eastAsia="宋体"/>
+            <w:sz w:val="21"/>
+          </w:rPr>
+          <w:fldChar w:fldCharType="separate"/>
+        </w:r>
+        <w:r>
+          <w:rPr>
+            <w:rFonts w:ascii="Times New Roman" w:hAnsi="Times New Roman" w:eastAsia="宋体"/>
+            <w:sz w:val="21"/>
+          </w:rPr>
+          <w:t xml:space="preserve"/>
+        </w:r>
+        <w:r>
+          <w:rPr>
+            <w:rFonts w:ascii="Times New Roman" w:hAnsi="Times New Roman" w:eastAsia="宋体"/>
+            <w:sz w:val="21"/>
+          </w:rPr>
+          <w:fldChar w:fldCharType="end"/>
+        </w:r>
+      </w:hyperlink>
+    </w:p>
+    <w:p w:rsidR="00TOC000">
+      <w:pPr>
+        <w:tabs>
+          <w:tab w:val="right" w:leader="dot" w:pos="9072"/>
+        </w:tabs>
+        <w:spacing w:after="60" w:line="300" w:lineRule="auto"/>
+        <w:ind w:left="425"/>
+      </w:pPr>
+      <w:hyperlink w:anchor="_TocReport009" w:history="1">
+        <w:r>
+          <w:rPr>
+            <w:rFonts w:ascii="Times New Roman" w:hAnsi="Times New Roman" w:eastAsia="宋体"/>
+            <w:sz w:val="21"/>
+          </w:rPr>
+          <w:t xml:space="preserve">3.1 我们 vs 论文</w:t>
+        </w:r>
+        <w:r>
+          <w:rPr>
+            <w:rFonts w:ascii="Times New Roman" w:hAnsi="Times New Roman" w:eastAsia="宋体"/>
+            <w:sz w:val="21"/>
+          </w:rPr>
+          <w:tab/>
+        </w:r>
+        <w:r>
+          <w:rPr>
+            <w:rFonts w:ascii="Times New Roman" w:hAnsi="Times New Roman" w:eastAsia="宋体"/>
+            <w:sz w:val="21"/>
+          </w:rPr>
+          <w:fldChar w:fldCharType="begin"/>
+        </w:r>
+        <w:r>
+          <w:rPr>
+            <w:rFonts w:ascii="Times New Roman" w:hAnsi="Times New Roman" w:eastAsia="宋体"/>
+            <w:sz w:val="21"/>
+          </w:rPr>
+          <w:instrText xml:space="preserve"> PAGEREF _TocReport009 \h </w:instrText>
+        </w:r>
+        <w:r>
+          <w:rPr>
+            <w:rFonts w:ascii="Times New Roman" w:hAnsi="Times New Roman" w:eastAsia="宋体"/>
+            <w:sz w:val="21"/>
+          </w:rPr>
+          <w:fldChar w:fldCharType="separate"/>
+        </w:r>
+        <w:r>
+          <w:rPr>
+            <w:rFonts w:ascii="Times New Roman" w:hAnsi="Times New Roman" w:eastAsia="宋体"/>
+            <w:sz w:val="21"/>
+          </w:rPr>
+          <w:t xml:space="preserve"/>
+        </w:r>
+        <w:r>
+          <w:rPr>
+            <w:rFonts w:ascii="Times New Roman" w:hAnsi="Times New Roman" w:eastAsia="宋体"/>
+            <w:sz w:val="21"/>
+          </w:rPr>
+          <w:fldChar w:fldCharType="end"/>
+        </w:r>
+      </w:hyperlink>
+    </w:p>
+    <w:p w:rsidR="00TOC000">
+      <w:pPr>
+        <w:tabs>
+          <w:tab w:val="right" w:leader="dot" w:pos="9072"/>
+        </w:tabs>
+        <w:spacing w:after="60" w:line="300" w:lineRule="auto"/>
+        <w:ind w:left="425"/>
+      </w:pPr>
+      <w:hyperlink w:anchor="_TocReport010" w:history="1">
+        <w:r>
+          <w:rPr>
+            <w:rFonts w:ascii="Times New Roman" w:hAnsi="Times New Roman" w:eastAsia="宋体"/>
+            <w:sz w:val="21"/>
+          </w:rPr>
+          <w:t xml:space="preserve">3.2 主要偏差及原因</w:t>
+        </w:r>
+        <w:r>
+          <w:rPr>
+            <w:rFonts w:ascii="Times New Roman" w:hAnsi="Times New Roman" w:eastAsia="宋体"/>
+            <w:sz w:val="21"/>
+          </w:rPr>
+          <w:tab/>
+        </w:r>
+        <w:r>
+          <w:rPr>
+            <w:rFonts w:ascii="Times New Roman" w:hAnsi="Times New Roman" w:eastAsia="宋体"/>
+            <w:sz w:val="21"/>
+          </w:rPr>
+          <w:fldChar w:fldCharType="begin"/>
+        </w:r>
+        <w:r>
+          <w:rPr>
+            <w:rFonts w:ascii="Times New Roman" w:hAnsi="Times New Roman" w:eastAsia="宋体"/>
+            <w:sz w:val="21"/>
+          </w:rPr>
+          <w:instrText xml:space="preserve"> PAGEREF _TocReport010 \h </w:instrText>
+        </w:r>
+        <w:r>
+          <w:rPr>
+            <w:rFonts w:ascii="Times New Roman" w:hAnsi="Times New Roman" w:eastAsia="宋体"/>
+            <w:sz w:val="21"/>
+          </w:rPr>
+          <w:fldChar w:fldCharType="separate"/>
+        </w:r>
+        <w:r>
+          <w:rPr>
+            <w:rFonts w:ascii="Times New Roman" w:hAnsi="Times New Roman" w:eastAsia="宋体"/>
+            <w:sz w:val="21"/>
+          </w:rPr>
+          <w:t xml:space="preserve"/>
+        </w:r>
+        <w:r>
+          <w:rPr>
+            <w:rFonts w:ascii="Times New Roman" w:hAnsi="Times New Roman" w:eastAsia="宋体"/>
+            <w:sz w:val="21"/>
+          </w:rPr>
+          <w:fldChar w:fldCharType="end"/>
+        </w:r>
+      </w:hyperlink>
+    </w:p>
+    <w:p w:rsidR="00TOC000">
+      <w:pPr>
+        <w:tabs>
+          <w:tab w:val="right" w:leader="dot" w:pos="9072"/>
+        </w:tabs>
+        <w:spacing w:after="60" w:line="300" w:lineRule="auto"/>
+        <w:ind w:left="425"/>
+      </w:pPr>
+      <w:hyperlink w:anchor="_TocReport011" w:history="1">
+        <w:r>
+          <w:rPr>
+            <w:rFonts w:ascii="Times New Roman" w:hAnsi="Times New Roman" w:eastAsia="宋体"/>
+            <w:sz w:val="21"/>
+          </w:rPr>
+          <w:t xml:space="preserve">3.3 图</w:t>
+        </w:r>
+        <w:r>
+          <w:rPr>
+            <w:rFonts w:ascii="Times New Roman" w:hAnsi="Times New Roman" w:eastAsia="宋体"/>
+            <w:sz w:val="21"/>
+          </w:rPr>
+          <w:tab/>
+        </w:r>
+        <w:r>
+          <w:rPr>
+            <w:rFonts w:ascii="Times New Roman" w:hAnsi="Times New Roman" w:eastAsia="宋体"/>
+            <w:sz w:val="21"/>
+          </w:rPr>
+          <w:fldChar w:fldCharType="begin"/>
+        </w:r>
+        <w:r>
+          <w:rPr>
+            <w:rFonts w:ascii="Times New Roman" w:hAnsi="Times New Roman" w:eastAsia="宋体"/>
+            <w:sz w:val="21"/>
+          </w:rPr>
+          <w:instrText xml:space="preserve"> PAGEREF _TocReport011 \h </w:instrText>
+        </w:r>
+        <w:r>
+          <w:rPr>
+            <w:rFonts w:ascii="Times New Roman" w:hAnsi="Times New Roman" w:eastAsia="宋体"/>
+            <w:sz w:val="21"/>
+          </w:rPr>
+          <w:fldChar w:fldCharType="separate"/>
+        </w:r>
+        <w:r>
+          <w:rPr>
+            <w:rFonts w:ascii="Times New Roman" w:hAnsi="Times New Roman" w:eastAsia="宋体"/>
+            <w:sz w:val="21"/>
+          </w:rPr>
+          <w:t xml:space="preserve"/>
+        </w:r>
+        <w:r>
+          <w:rPr>
+            <w:rFonts w:ascii="Times New Roman" w:hAnsi="Times New Roman" w:eastAsia="宋体"/>
+            <w:sz w:val="21"/>
+          </w:rPr>
+          <w:fldChar w:fldCharType="end"/>
+        </w:r>
+      </w:hyperlink>
+    </w:p>
+    <w:p w:rsidR="00TOC000">
+      <w:pPr>
+        <w:tabs>
+          <w:tab w:val="right" w:leader="dot" w:pos="9072"/>
+        </w:tabs>
+        <w:spacing w:after="60" w:line="300" w:lineRule="auto"/>
+        <w:ind w:left="425"/>
+      </w:pPr>
+      <w:hyperlink w:anchor="_TocReport012" w:history="1">
+        <w:r>
+          <w:rPr>
+            <w:rFonts w:ascii="Times New Roman" w:hAnsi="Times New Roman" w:eastAsia="宋体"/>
+            <w:sz w:val="21"/>
+          </w:rPr>
+          <w:t xml:space="preserve">3.4 延长到 2025 年</w:t>
+        </w:r>
+        <w:r>
+          <w:rPr>
+            <w:rFonts w:ascii="Times New Roman" w:hAnsi="Times New Roman" w:eastAsia="宋体"/>
+            <w:sz w:val="21"/>
+          </w:rPr>
+          <w:tab/>
+        </w:r>
+        <w:r>
+          <w:rPr>
+            <w:rFonts w:ascii="Times New Roman" w:hAnsi="Times New Roman" w:eastAsia="宋体"/>
+            <w:sz w:val="21"/>
+          </w:rPr>
+          <w:fldChar w:fldCharType="begin"/>
+        </w:r>
+        <w:r>
+          <w:rPr>
+            <w:rFonts w:ascii="Times New Roman" w:hAnsi="Times New Roman" w:eastAsia="宋体"/>
+            <w:sz w:val="21"/>
+          </w:rPr>
+          <w:instrText xml:space="preserve"> PAGEREF _TocReport012 \h </w:instrText>
+        </w:r>
+        <w:r>
+          <w:rPr>
+            <w:rFonts w:ascii="Times New Roman" w:hAnsi="Times New Roman" w:eastAsia="宋体"/>
+            <w:sz w:val="21"/>
+          </w:rPr>
+          <w:fldChar w:fldCharType="separate"/>
+        </w:r>
+        <w:r>
+          <w:rPr>
+            <w:rFonts w:ascii="Times New Roman" w:hAnsi="Times New Roman" w:eastAsia="宋体"/>
+            <w:sz w:val="21"/>
+          </w:rPr>
+          <w:t xml:space="preserve"/>
+        </w:r>
+        <w:r>
+          <w:rPr>
+            <w:rFonts w:ascii="Times New Roman" w:hAnsi="Times New Roman" w:eastAsia="宋体"/>
+            <w:sz w:val="21"/>
+          </w:rPr>
+          <w:fldChar w:fldCharType="end"/>
+        </w:r>
+      </w:hyperlink>
+    </w:p>
+    <w:p w:rsidR="00TOC000">
+      <w:pPr>
+        <w:tabs>
+          <w:tab w:val="right" w:leader="dot" w:pos="9072"/>
+        </w:tabs>
+        <w:spacing w:after="60" w:line="300" w:lineRule="auto"/>
+        <w:ind w:left="0"/>
+      </w:pPr>
+      <w:hyperlink w:anchor="_TocReport013" w:history="1">
+        <w:r>
+          <w:rPr>
+            <w:rFonts w:ascii="Times New Roman" w:hAnsi="Times New Roman" w:eastAsia="宋体"/>
+            <w:b/>
+            <w:sz w:val="22"/>
+          </w:rPr>
+          <w:t xml:space="preserve">4. Li（2024）：Replicating and digesting anomalies in the Chinese A-share market</w:t>
+        </w:r>
+        <w:r>
+          <w:rPr>
+            <w:rFonts w:ascii="Times New Roman" w:hAnsi="Times New Roman" w:eastAsia="宋体"/>
+            <w:sz w:val="21"/>
+          </w:rPr>
+          <w:tab/>
+        </w:r>
+        <w:r>
+          <w:rPr>
+            <w:rFonts w:ascii="Times New Roman" w:hAnsi="Times New Roman" w:eastAsia="宋体"/>
+            <w:sz w:val="21"/>
+          </w:rPr>
+          <w:fldChar w:fldCharType="begin"/>
+        </w:r>
+        <w:r>
+          <w:rPr>
+            <w:rFonts w:ascii="Times New Roman" w:hAnsi="Times New Roman" w:eastAsia="宋体"/>
+            <w:sz w:val="21"/>
+          </w:rPr>
+          <w:instrText xml:space="preserve"> PAGEREF _TocReport013 \h </w:instrText>
+        </w:r>
+        <w:r>
+          <w:rPr>
+            <w:rFonts w:ascii="Times New Roman" w:hAnsi="Times New Roman" w:eastAsia="宋体"/>
+            <w:sz w:val="21"/>
+          </w:rPr>
+          <w:fldChar w:fldCharType="separate"/>
+        </w:r>
+        <w:r>
+          <w:rPr>
+            <w:rFonts w:ascii="Times New Roman" w:hAnsi="Times New Roman" w:eastAsia="宋体"/>
+            <w:sz w:val="21"/>
+          </w:rPr>
+          <w:t xml:space="preserve"/>
+        </w:r>
+        <w:r>
+          <w:rPr>
+            <w:rFonts w:ascii="Times New Roman" w:hAnsi="Times New Roman" w:eastAsia="宋体"/>
+            <w:sz w:val="21"/>
+          </w:rPr>
+          <w:fldChar w:fldCharType="end"/>
+        </w:r>
+      </w:hyperlink>
+    </w:p>
+    <w:p w:rsidR="00TOC000">
+      <w:pPr>
+        <w:tabs>
+          <w:tab w:val="right" w:leader="dot" w:pos="9072"/>
+        </w:tabs>
+        <w:spacing w:after="60" w:line="300" w:lineRule="auto"/>
+        <w:ind w:left="425"/>
+      </w:pPr>
+      <w:hyperlink w:anchor="_TocReport014" w:history="1">
+        <w:r>
+          <w:rPr>
+            <w:rFonts w:ascii="Times New Roman" w:hAnsi="Times New Roman" w:eastAsia="宋体"/>
+            <w:sz w:val="21"/>
+          </w:rPr>
+          <w:t xml:space="preserve">4.1 我们 vs 论文</w:t>
+        </w:r>
+        <w:r>
+          <w:rPr>
+            <w:rFonts w:ascii="Times New Roman" w:hAnsi="Times New Roman" w:eastAsia="宋体"/>
+            <w:sz w:val="21"/>
+          </w:rPr>
+          <w:tab/>
+        </w:r>
+        <w:r>
+          <w:rPr>
+            <w:rFonts w:ascii="Times New Roman" w:hAnsi="Times New Roman" w:eastAsia="宋体"/>
+            <w:sz w:val="21"/>
+          </w:rPr>
+          <w:fldChar w:fldCharType="begin"/>
+        </w:r>
+        <w:r>
+          <w:rPr>
+            <w:rFonts w:ascii="Times New Roman" w:hAnsi="Times New Roman" w:eastAsia="宋体"/>
+            <w:sz w:val="21"/>
+          </w:rPr>
+          <w:instrText xml:space="preserve"> PAGEREF _TocReport014 \h </w:instrText>
+        </w:r>
+        <w:r>
+          <w:rPr>
+            <w:rFonts w:ascii="Times New Roman" w:hAnsi="Times New Roman" w:eastAsia="宋体"/>
+            <w:sz w:val="21"/>
+          </w:rPr>
+          <w:fldChar w:fldCharType="separate"/>
+        </w:r>
+        <w:r>
+          <w:rPr>
+            <w:rFonts w:ascii="Times New Roman" w:hAnsi="Times New Roman" w:eastAsia="宋体"/>
+            <w:sz w:val="21"/>
+          </w:rPr>
+          <w:t xml:space="preserve"/>
+        </w:r>
+        <w:r>
+          <w:rPr>
+            <w:rFonts w:ascii="Times New Roman" w:hAnsi="Times New Roman" w:eastAsia="宋体"/>
+            <w:sz w:val="21"/>
+          </w:rPr>
+          <w:fldChar w:fldCharType="end"/>
+        </w:r>
+      </w:hyperlink>
+    </w:p>
+    <w:p w:rsidR="00TOC000">
+      <w:pPr>
+        <w:tabs>
+          <w:tab w:val="right" w:leader="dot" w:pos="9072"/>
+        </w:tabs>
+        <w:spacing w:after="60" w:line="300" w:lineRule="auto"/>
+        <w:ind w:left="425"/>
+      </w:pPr>
+      <w:hyperlink w:anchor="_TocReport015" w:history="1">
+        <w:r>
+          <w:rPr>
+            <w:rFonts w:ascii="Times New Roman" w:hAnsi="Times New Roman" w:eastAsia="宋体"/>
+            <w:sz w:val="21"/>
+          </w:rPr>
+          <w:t xml:space="preserve">4.2 主要偏差及原因</w:t>
+        </w:r>
+        <w:r>
+          <w:rPr>
+            <w:rFonts w:ascii="Times New Roman" w:hAnsi="Times New Roman" w:eastAsia="宋体"/>
+            <w:sz w:val="21"/>
+          </w:rPr>
+          <w:tab/>
+        </w:r>
+        <w:r>
+          <w:rPr>
+            <w:rFonts w:ascii="Times New Roman" w:hAnsi="Times New Roman" w:eastAsia="宋体"/>
+            <w:sz w:val="21"/>
+          </w:rPr>
+          <w:fldChar w:fldCharType="begin"/>
+        </w:r>
+        <w:r>
+          <w:rPr>
+            <w:rFonts w:ascii="Times New Roman" w:hAnsi="Times New Roman" w:eastAsia="宋体"/>
+            <w:sz w:val="21"/>
+          </w:rPr>
+          <w:instrText xml:space="preserve"> PAGEREF _TocReport015 \h </w:instrText>
+        </w:r>
+        <w:r>
+          <w:rPr>
+            <w:rFonts w:ascii="Times New Roman" w:hAnsi="Times New Roman" w:eastAsia="宋体"/>
+            <w:sz w:val="21"/>
+          </w:rPr>
+          <w:fldChar w:fldCharType="separate"/>
+        </w:r>
+        <w:r>
+          <w:rPr>
+            <w:rFonts w:ascii="Times New Roman" w:hAnsi="Times New Roman" w:eastAsia="宋体"/>
+            <w:sz w:val="21"/>
+          </w:rPr>
+          <w:t xml:space="preserve"/>
+        </w:r>
+        <w:r>
+          <w:rPr>
+            <w:rFonts w:ascii="Times New Roman" w:hAnsi="Times New Roman" w:eastAsia="宋体"/>
+            <w:sz w:val="21"/>
+          </w:rPr>
+          <w:fldChar w:fldCharType="end"/>
+        </w:r>
+      </w:hyperlink>
+    </w:p>
+    <w:p w:rsidR="00TOC000">
+      <w:pPr>
+        <w:tabs>
+          <w:tab w:val="right" w:leader="dot" w:pos="9072"/>
+        </w:tabs>
+        <w:spacing w:after="60" w:line="300" w:lineRule="auto"/>
+        <w:ind w:left="425"/>
+      </w:pPr>
+      <w:hyperlink w:anchor="_TocReport016" w:history="1">
+        <w:r>
+          <w:rPr>
+            <w:rFonts w:ascii="Times New Roman" w:hAnsi="Times New Roman" w:eastAsia="宋体"/>
+            <w:sz w:val="21"/>
+          </w:rPr>
+          <w:t xml:space="preserve">4.3 延长到 2026 年</w:t>
+        </w:r>
+        <w:r>
+          <w:rPr>
+            <w:rFonts w:ascii="Times New Roman" w:hAnsi="Times New Roman" w:eastAsia="宋体"/>
+            <w:sz w:val="21"/>
+          </w:rPr>
+          <w:tab/>
+        </w:r>
+        <w:r>
+          <w:rPr>
+            <w:rFonts w:ascii="Times New Roman" w:hAnsi="Times New Roman" w:eastAsia="宋体"/>
+            <w:sz w:val="21"/>
+          </w:rPr>
+          <w:fldChar w:fldCharType="begin"/>
+        </w:r>
+        <w:r>
+          <w:rPr>
+            <w:rFonts w:ascii="Times New Roman" w:hAnsi="Times New Roman" w:eastAsia="宋体"/>
+            <w:sz w:val="21"/>
+          </w:rPr>
+          <w:instrText xml:space="preserve"> PAGEREF _TocReport016 \h </w:instrText>
+        </w:r>
+        <w:r>
+          <w:rPr>
+            <w:rFonts w:ascii="Times New Roman" w:hAnsi="Times New Roman" w:eastAsia="宋体"/>
+            <w:sz w:val="21"/>
+          </w:rPr>
+          <w:fldChar w:fldCharType="separate"/>
+        </w:r>
+        <w:r>
+          <w:rPr>
+            <w:rFonts w:ascii="Times New Roman" w:hAnsi="Times New Roman" w:eastAsia="宋体"/>
+            <w:sz w:val="21"/>
+          </w:rPr>
+          <w:t xml:space="preserve"/>
+        </w:r>
+        <w:r>
+          <w:rPr>
+            <w:rFonts w:ascii="Times New Roman" w:hAnsi="Times New Roman" w:eastAsia="宋体"/>
+            <w:sz w:val="21"/>
+          </w:rPr>
+          <w:fldChar w:fldCharType="end"/>
+        </w:r>
+      </w:hyperlink>
+    </w:p>
+    <w:p w:rsidR="00TOC000">
+      <w:pPr>
+        <w:tabs>
+          <w:tab w:val="right" w:leader="dot" w:pos="9072"/>
+        </w:tabs>
+        <w:spacing w:after="60" w:line="300" w:lineRule="auto"/>
+        <w:ind w:left="0"/>
+      </w:pPr>
+      <w:hyperlink w:anchor="_TocReport017" w:history="1">
+        <w:r>
+          <w:rPr>
+            <w:rFonts w:ascii="Times New Roman" w:hAnsi="Times New Roman" w:eastAsia="宋体"/>
+            <w:b/>
+            <w:sz w:val="22"/>
+          </w:rPr>
+          <w:t xml:space="preserve">5. 做不了的部分及原因</w:t>
+        </w:r>
+        <w:r>
+          <w:rPr>
+            <w:rFonts w:ascii="Times New Roman" w:hAnsi="Times New Roman" w:eastAsia="宋体"/>
+            <w:sz w:val="21"/>
+          </w:rPr>
+          <w:tab/>
+        </w:r>
+        <w:r>
+          <w:rPr>
+            <w:rFonts w:ascii="Times New Roman" w:hAnsi="Times New Roman" w:eastAsia="宋体"/>
+            <w:sz w:val="21"/>
+          </w:rPr>
+          <w:fldChar w:fldCharType="begin"/>
+        </w:r>
+        <w:r>
+          <w:rPr>
+            <w:rFonts w:ascii="Times New Roman" w:hAnsi="Times New Roman" w:eastAsia="宋体"/>
+            <w:sz w:val="21"/>
+          </w:rPr>
+          <w:instrText xml:space="preserve"> PAGEREF _TocReport017 \h </w:instrText>
+        </w:r>
+        <w:r>
+          <w:rPr>
+            <w:rFonts w:ascii="Times New Roman" w:hAnsi="Times New Roman" w:eastAsia="宋体"/>
+            <w:sz w:val="21"/>
+          </w:rPr>
+          <w:fldChar w:fldCharType="separate"/>
+        </w:r>
+        <w:r>
+          <w:rPr>
+            <w:rFonts w:ascii="Times New Roman" w:hAnsi="Times New Roman" w:eastAsia="宋体"/>
+            <w:sz w:val="21"/>
+          </w:rPr>
+          <w:t xml:space="preserve"/>
+        </w:r>
+        <w:r>
+          <w:rPr>
+            <w:rFonts w:ascii="Times New Roman" w:hAnsi="Times New Roman" w:eastAsia="宋体"/>
+            <w:sz w:val="21"/>
+          </w:rPr>
+          <w:fldChar w:fldCharType="end"/>
+        </w:r>
+      </w:hyperlink>
+    </w:p>
+    <w:p w:rsidR="00TOC000">
+      <w:pPr>
+        <w:tabs>
+          <w:tab w:val="right" w:leader="dot" w:pos="9072"/>
+        </w:tabs>
+        <w:spacing w:after="60" w:line="300" w:lineRule="auto"/>
+        <w:ind w:left="0"/>
+      </w:pPr>
+      <w:hyperlink w:anchor="_TocReport018" w:history="1">
+        <w:r>
+          <w:rPr>
+            <w:rFonts w:ascii="Times New Roman" w:hAnsi="Times New Roman" w:eastAsia="宋体"/>
+            <w:b/>
+            <w:sz w:val="22"/>
+          </w:rPr>
+          <w:t xml:space="preserve">6. 数据与已知偏差</w:t>
+        </w:r>
+        <w:r>
+          <w:rPr>
+            <w:rFonts w:ascii="Times New Roman" w:hAnsi="Times New Roman" w:eastAsia="宋体"/>
+            <w:sz w:val="21"/>
+          </w:rPr>
+          <w:tab/>
+        </w:r>
+        <w:r>
+          <w:rPr>
+            <w:rFonts w:ascii="Times New Roman" w:hAnsi="Times New Roman" w:eastAsia="宋体"/>
+            <w:sz w:val="21"/>
+          </w:rPr>
+          <w:fldChar w:fldCharType="begin"/>
+        </w:r>
+        <w:r>
+          <w:rPr>
+            <w:rFonts w:ascii="Times New Roman" w:hAnsi="Times New Roman" w:eastAsia="宋体"/>
+            <w:sz w:val="21"/>
+          </w:rPr>
+          <w:instrText xml:space="preserve"> PAGEREF _TocReport018 \h </w:instrText>
+        </w:r>
+        <w:r>
+          <w:rPr>
+            <w:rFonts w:ascii="Times New Roman" w:hAnsi="Times New Roman" w:eastAsia="宋体"/>
+            <w:sz w:val="21"/>
+          </w:rPr>
+          <w:fldChar w:fldCharType="separate"/>
+        </w:r>
+        <w:r>
+          <w:rPr>
+            <w:rFonts w:ascii="Times New Roman" w:hAnsi="Times New Roman" w:eastAsia="宋体"/>
+            <w:sz w:val="21"/>
+          </w:rPr>
+          <w:t xml:space="preserve"/>
+        </w:r>
+        <w:r>
+          <w:rPr>
+            <w:rFonts w:ascii="Times New Roman" w:hAnsi="Times New Roman" w:eastAsia="宋体"/>
+            <w:sz w:val="21"/>
+          </w:rPr>
+          <w:fldChar w:fldCharType="end"/>
+        </w:r>
+      </w:hyperlink>
+    </w:p>
+    <w:p w:rsidR="00TOC000">
+      <w:pPr>
+        <w:tabs>
+          <w:tab w:val="right" w:leader="dot" w:pos="9072"/>
+        </w:tabs>
+        <w:spacing w:after="60" w:line="300" w:lineRule="auto"/>
+        <w:ind w:left="0"/>
+      </w:pPr>
+      <w:hyperlink w:anchor="_TocReport019" w:history="1">
+        <w:r>
+          <w:rPr>
+            <w:rFonts w:ascii="Times New Roman" w:hAnsi="Times New Roman" w:eastAsia="宋体"/>
+            <w:b/>
+            <w:sz w:val="22"/>
+          </w:rPr>
+          <w:t xml:space="preserve">附：复跑方式</w:t>
+        </w:r>
+        <w:r>
+          <w:rPr>
+            <w:rFonts w:ascii="Times New Roman" w:hAnsi="Times New Roman" w:eastAsia="宋体"/>
+            <w:sz w:val="21"/>
+          </w:rPr>
+          <w:tab/>
+        </w:r>
+        <w:r>
+          <w:rPr>
+            <w:rFonts w:ascii="Times New Roman" w:hAnsi="Times New Roman" w:eastAsia="宋体"/>
+            <w:sz w:val="21"/>
+          </w:rPr>
+          <w:fldChar w:fldCharType="begin"/>
+        </w:r>
+        <w:r>
+          <w:rPr>
+            <w:rFonts w:ascii="Times New Roman" w:hAnsi="Times New Roman" w:eastAsia="宋体"/>
+            <w:sz w:val="21"/>
+          </w:rPr>
+          <w:instrText xml:space="preserve"> PAGEREF _TocReport019 \h </w:instrText>
+        </w:r>
+        <w:r>
+          <w:rPr>
+            <w:rFonts w:ascii="Times New Roman" w:hAnsi="Times New Roman" w:eastAsia="宋体"/>
+            <w:sz w:val="21"/>
+          </w:rPr>
+          <w:fldChar w:fldCharType="separate"/>
+        </w:r>
+        <w:r>
+          <w:rPr>
+            <w:rFonts w:ascii="Times New Roman" w:hAnsi="Times New Roman" w:eastAsia="宋体"/>
+            <w:sz w:val="21"/>
+          </w:rPr>
+          <w:t xml:space="preserve"/>
+        </w:r>
+        <w:r>
+          <w:rPr>
+            <w:rFonts w:ascii="Times New Roman" w:hAnsi="Times New Roman" w:eastAsia="宋体"/>
+            <w:sz w:val="21"/>
+          </w:rPr>
+          <w:fldChar w:fldCharType="end"/>
+        </w:r>
+      </w:hyperlink>
+      <w:r>
+        <w:rPr>
+          <w:rFonts w:ascii="Times New Roman" w:hAnsi="Times New Roman" w:eastAsia="宋体"/>
+          <w:sz w:val="21"/>
+        </w:rPr>
+        <w:fldChar w:fldCharType="end"/>
+      </w:r>
+    </w:p>
+    <w:p w:rsidR="00TOC000">
+      <w:r>
+        <w:br w:type="page"/>
+      </w:r>
+    </w:p>
     <w:p>
       <w:pPr>
         <w:pStyle w:val="4"/>
@@ -158,6 +1357,7 @@
           <w:color w:val="auto"/>
         </w:rPr>
       </w:pPr>
+      <w:bookmarkStart w:id="9001" w:name="_TocReport001"/>
       <w:r>
         <w:rPr>
           <w:rFonts w:ascii="Times New Roman" w:hAnsi="Times New Roman" w:eastAsia="黑体" w:cs="Times New Roman"/>
@@ -165,6 +1365,7 @@
         </w:rPr>
         <w:t>0. 结论一页</w:t>
       </w:r>
+      <w:bookmarkEnd w:id="9001"/>
     </w:p>
     <w:tbl>
       <w:tblPr>
@@ -993,6 +2194,7 @@
           <w:color w:val="auto"/>
         </w:rPr>
       </w:pPr>
+      <w:bookmarkStart w:id="9002" w:name="_TocReport002"/>
       <w:r>
         <w:rPr>
           <w:rFonts w:ascii="Times New Roman" w:hAnsi="Times New Roman" w:eastAsia="黑体" w:cs="Times New Roman"/>
@@ -1000,6 +2202,7 @@
         </w:rPr>
         <w:t>1. 做法要点</w:t>
       </w:r>
+      <w:bookmarkEnd w:id="9002"/>
     </w:p>
     <w:p>
       <w:pPr>
@@ -1314,6 +2517,7 @@
           <w:color w:val="auto"/>
         </w:rPr>
       </w:pPr>
+      <w:bookmarkStart w:id="9003" w:name="_TocReport003"/>
       <w:r>
         <w:rPr>
           <w:rFonts w:ascii="Times New Roman" w:hAnsi="Times New Roman" w:eastAsia="黑体" w:cs="Times New Roman"/>
@@ -1321,6 +2525,7 @@
         </w:rPr>
         <w:t>2. LSY（2019）：Size and value in China</w:t>
       </w:r>
+      <w:bookmarkEnd w:id="9003"/>
     </w:p>
     <w:p>
       <w:pPr>
@@ -1329,6 +2534,7 @@
           <w:color w:val="auto"/>
         </w:rPr>
       </w:pPr>
+      <w:bookmarkStart w:id="9004" w:name="_TocReport004"/>
       <w:r>
         <w:rPr>
           <w:rFonts w:ascii="Times New Roman" w:hAnsi="Times New Roman" w:eastAsia="黑体" w:cs="Times New Roman"/>
@@ -1336,6 +2542,7 @@
         </w:rPr>
         <w:t>2.1 我们 vs 论文</w:t>
       </w:r>
+      <w:bookmarkEnd w:id="9004"/>
     </w:p>
     <w:tbl>
       <w:tblPr>
@@ -2938,6 +4145,7 @@
           <w:color w:val="auto"/>
         </w:rPr>
       </w:pPr>
+      <w:bookmarkStart w:id="9005" w:name="_TocReport005"/>
       <w:r>
         <w:rPr>
           <w:rFonts w:ascii="Times New Roman" w:hAnsi="Times New Roman" w:eastAsia="黑体" w:cs="Times New Roman"/>
@@ -2945,6 +4153,7 @@
         </w:rPr>
         <w:t>2.2 主要偏差及原因</w:t>
       </w:r>
+      <w:bookmarkEnd w:id="9005"/>
     </w:p>
     <w:p>
       <w:pPr>
@@ -3142,6 +4351,7 @@
           <w:color w:val="auto"/>
         </w:rPr>
       </w:pPr>
+      <w:bookmarkStart w:id="9006" w:name="_TocReport006"/>
       <w:r>
         <w:rPr>
           <w:rFonts w:ascii="Times New Roman" w:hAnsi="Times New Roman" w:eastAsia="黑体" w:cs="Times New Roman"/>
@@ -3149,6 +4359,7 @@
         </w:rPr>
         <w:t>2.3 图</w:t>
       </w:r>
+      <w:bookmarkEnd w:id="9006"/>
     </w:p>
     <w:p>
       <w:pPr>
@@ -3321,6 +4532,7 @@
           <w:color w:val="auto"/>
         </w:rPr>
       </w:pPr>
+      <w:bookmarkStart w:id="9007" w:name="_TocReport007"/>
       <w:r>
         <w:rPr>
           <w:rFonts w:ascii="Times New Roman" w:hAnsi="Times New Roman" w:eastAsia="黑体" w:cs="Times New Roman"/>
@@ -3328,6 +4540,7 @@
         </w:rPr>
         <w:t>2.4 延长到 2026 年</w:t>
       </w:r>
+      <w:bookmarkEnd w:id="9007"/>
     </w:p>
     <w:tbl>
       <w:tblPr>
@@ -3857,6 +5070,7 @@
           <w:color w:val="auto"/>
         </w:rPr>
       </w:pPr>
+      <w:bookmarkStart w:id="9008" w:name="_TocReport008"/>
       <w:r>
         <w:rPr>
           <w:rFonts w:ascii="Times New Roman" w:hAnsi="Times New Roman" w:eastAsia="黑体" w:cs="Times New Roman"/>
@@ -3864,6 +5078,7 @@
         </w:rPr>
         <w:t>3. Allen（2024）：Dissecting the long-term performance of the Chinese stock market</w:t>
       </w:r>
+      <w:bookmarkEnd w:id="9008"/>
     </w:p>
     <w:p>
       <w:pPr>
@@ -3872,6 +5087,7 @@
           <w:color w:val="auto"/>
         </w:rPr>
       </w:pPr>
+      <w:bookmarkStart w:id="9009" w:name="_TocReport009"/>
       <w:r>
         <w:rPr>
           <w:rFonts w:ascii="Times New Roman" w:hAnsi="Times New Roman" w:eastAsia="黑体" w:cs="Times New Roman"/>
@@ -3879,6 +5095,7 @@
         </w:rPr>
         <w:t>3.1 我们 vs 论文</w:t>
       </w:r>
+      <w:bookmarkEnd w:id="9009"/>
     </w:p>
     <w:tbl>
       <w:tblPr>
@@ -5169,6 +6386,7 @@
           <w:color w:val="auto"/>
         </w:rPr>
       </w:pPr>
+      <w:bookmarkStart w:id="9010" w:name="_TocReport010"/>
       <w:r>
         <w:rPr>
           <w:rFonts w:ascii="Times New Roman" w:hAnsi="Times New Roman" w:eastAsia="黑体" w:cs="Times New Roman"/>
@@ -5176,6 +6394,7 @@
         </w:rPr>
         <w:t>3.2 主要偏差及原因</w:t>
       </w:r>
+      <w:bookmarkEnd w:id="9010"/>
     </w:p>
     <w:p>
       <w:pPr>
@@ -5388,6 +6607,7 @@
           <w:color w:val="auto"/>
         </w:rPr>
       </w:pPr>
+      <w:bookmarkStart w:id="9011" w:name="_TocReport011"/>
       <w:r>
         <w:rPr>
           <w:rFonts w:ascii="Times New Roman" w:hAnsi="Times New Roman" w:eastAsia="黑体" w:cs="Times New Roman"/>
@@ -5395,6 +6615,7 @@
         </w:rPr>
         <w:t>3.3 图</w:t>
       </w:r>
+      <w:bookmarkEnd w:id="9011"/>
     </w:p>
     <w:p>
       <w:pPr>
@@ -5615,6 +6836,7 @@
           <w:color w:val="auto"/>
         </w:rPr>
       </w:pPr>
+      <w:bookmarkStart w:id="9012" w:name="_TocReport012"/>
       <w:r>
         <w:rPr>
           <w:rFonts w:ascii="Times New Roman" w:hAnsi="Times New Roman" w:eastAsia="黑体" w:cs="Times New Roman"/>
@@ -5622,6 +6844,7 @@
         </w:rPr>
         <w:t>3.4 延长到 2025 年</w:t>
       </w:r>
+      <w:bookmarkEnd w:id="9012"/>
     </w:p>
     <w:tbl>
       <w:tblPr>
@@ -6133,6 +7356,7 @@
           <w:color w:val="auto"/>
         </w:rPr>
       </w:pPr>
+      <w:bookmarkStart w:id="9013" w:name="_TocReport013"/>
       <w:r>
         <w:rPr>
           <w:rFonts w:ascii="Times New Roman" w:hAnsi="Times New Roman" w:eastAsia="黑体" w:cs="Times New Roman"/>
@@ -6140,6 +7364,7 @@
         </w:rPr>
         <w:t>4. Li（2024）：Replicating and digesting anomalies in the Chinese A-share market</w:t>
       </w:r>
+      <w:bookmarkEnd w:id="9013"/>
     </w:p>
     <w:p>
       <w:pPr>
@@ -6148,6 +7373,7 @@
           <w:color w:val="auto"/>
         </w:rPr>
       </w:pPr>
+      <w:bookmarkStart w:id="9014" w:name="_TocReport014"/>
       <w:r>
         <w:rPr>
           <w:rFonts w:ascii="Times New Roman" w:hAnsi="Times New Roman" w:eastAsia="黑体" w:cs="Times New Roman"/>
@@ -6155,6 +7381,7 @@
         </w:rPr>
         <w:t>4.1 我们 vs 论文</w:t>
       </w:r>
+      <w:bookmarkEnd w:id="9014"/>
     </w:p>
     <w:tbl>
       <w:tblPr>
@@ -7767,6 +8994,7 @@
           <w:color w:val="auto"/>
         </w:rPr>
       </w:pPr>
+      <w:bookmarkStart w:id="9015" w:name="_TocReport015"/>
       <w:r>
         <w:rPr>
           <w:rFonts w:ascii="Times New Roman" w:hAnsi="Times New Roman" w:eastAsia="黑体" w:cs="Times New Roman"/>
@@ -7774,6 +9002,7 @@
         </w:rPr>
         <w:t>4.2 主要偏差及原因</w:t>
       </w:r>
+      <w:bookmarkEnd w:id="9015"/>
     </w:p>
     <w:p>
       <w:pPr>
@@ -8192,6 +9421,7 @@
           <w:color w:val="auto"/>
         </w:rPr>
       </w:pPr>
+      <w:bookmarkStart w:id="9016" w:name="_TocReport016"/>
       <w:r>
         <w:rPr>
           <w:rFonts w:ascii="Times New Roman" w:hAnsi="Times New Roman" w:eastAsia="黑体" w:cs="Times New Roman"/>
@@ -8199,6 +9429,7 @@
         </w:rPr>
         <w:t>4.3 延长到 2026 年</w:t>
       </w:r>
+      <w:bookmarkEnd w:id="9016"/>
     </w:p>
     <w:p>
       <w:pPr>
@@ -8631,6 +9862,7 @@
           <w:color w:val="auto"/>
         </w:rPr>
       </w:pPr>
+      <w:bookmarkStart w:id="9017" w:name="_TocReport017"/>
       <w:r>
         <w:rPr>
           <w:rFonts w:ascii="Times New Roman" w:hAnsi="Times New Roman" w:eastAsia="黑体" w:cs="Times New Roman"/>
@@ -8638,6 +9870,7 @@
         </w:rPr>
         <w:t>5. 做不了的部分及原因</w:t>
       </w:r>
+      <w:bookmarkEnd w:id="9017"/>
     </w:p>
     <w:tbl>
       <w:tblPr>
@@ -9309,6 +10542,7 @@
           <w:color w:val="auto"/>
         </w:rPr>
       </w:pPr>
+      <w:bookmarkStart w:id="9018" w:name="_TocReport018"/>
       <w:r>
         <w:rPr>
           <w:rFonts w:ascii="Times New Roman" w:hAnsi="Times New Roman" w:eastAsia="黑体" w:cs="Times New Roman"/>
@@ -9316,6 +10550,7 @@
         </w:rPr>
         <w:t>6. 数据与已知偏差</w:t>
       </w:r>
+      <w:bookmarkEnd w:id="9018"/>
     </w:p>
     <w:p>
       <w:pPr>
@@ -9716,6 +10951,7 @@
           <w:color w:val="auto"/>
         </w:rPr>
       </w:pPr>
+      <w:bookmarkStart w:id="9019" w:name="_TocReport019"/>
       <w:r>
         <w:rPr>
           <w:rFonts w:ascii="Times New Roman" w:hAnsi="Times New Roman" w:eastAsia="黑体" w:cs="Times New Roman"/>
@@ -9723,6 +10959,7 @@
         </w:rPr>
         <w:t>附：复跑方式</w:t>
       </w:r>
+      <w:bookmarkEnd w:id="9019"/>
     </w:p>
     <w:p>
       <w:pPr>

</xml_diff>